<commit_message>
#93 Features added. 13/Nov/2024
</commit_message>
<xml_diff>
--- a/Documents/Device Spec Doc/Flexmold Controller.docx
+++ b/Documents/Device Spec Doc/Flexmold Controller.docx
@@ -13,6 +13,7 @@
           <w:szCs w:val="44"/>
         </w:rPr>
       </w:pPr>
+      <w:proofErr w:type="spellStart"/>
       <w:r>
         <w:rPr>
           <w:rFonts w:ascii="Arial" w:hAnsi="Arial" w:cs="Arial"/>
@@ -21,7 +22,18 @@
           <w:sz w:val="44"/>
           <w:szCs w:val="44"/>
         </w:rPr>
-        <w:t>Flexmold Controller</w:t>
+        <w:t>Flexmold</w:t>
+      </w:r>
+      <w:proofErr w:type="spellEnd"/>
+      <w:r>
+        <w:rPr>
+          <w:rFonts w:ascii="Arial" w:hAnsi="Arial" w:cs="Arial"/>
+          <w:b/>
+          <w:bCs/>
+          <w:sz w:val="44"/>
+          <w:szCs w:val="44"/>
+        </w:rPr>
+        <w:t xml:space="preserve"> Controller</w:t>
       </w:r>
     </w:p>
     <w:p>
@@ -278,6 +290,12 @@
         </w:rPr>
         <w:t>BEFORE MAKING ANY CONNECTIONS OR DISCONNECTIONS POWER MUST BE REMOVED FROM THE DEVICE.</w:t>
       </w:r>
+      <w:r>
+        <w:rPr>
+          <w:rFonts w:cstheme="minorHAnsi"/>
+        </w:rPr>
+        <w:t xml:space="preserve"> DO NOT TURN THE MOTOR BY HAND OR BY OTHER MEANS IF THE MOTOR IS CONNECTED TO THE DEVICE AND THE DEVICE IS POWERED OFF.</w:t>
+      </w:r>
     </w:p>
     <w:p>
       <w:pPr>
@@ -467,15 +485,33 @@
           <w:sz w:val="24"/>
           <w:szCs w:val="24"/>
         </w:rPr>
-        <w:t>The Fle</w:t>
-      </w:r>
-      <w:r>
-        <w:rPr>
-          <w:rFonts w:cstheme="minorHAnsi"/>
-          <w:sz w:val="24"/>
-          <w:szCs w:val="24"/>
-        </w:rPr>
-        <w:t xml:space="preserve">xmold Controller is </w:t>
+        <w:t xml:space="preserve">The </w:t>
+      </w:r>
+      <w:proofErr w:type="spellStart"/>
+      <w:r>
+        <w:rPr>
+          <w:rFonts w:cstheme="minorHAnsi"/>
+          <w:sz w:val="24"/>
+          <w:szCs w:val="24"/>
+        </w:rPr>
+        <w:t>Fle</w:t>
+      </w:r>
+      <w:r>
+        <w:rPr>
+          <w:rFonts w:cstheme="minorHAnsi"/>
+          <w:sz w:val="24"/>
+          <w:szCs w:val="24"/>
+        </w:rPr>
+        <w:t>xmold</w:t>
+      </w:r>
+      <w:proofErr w:type="spellEnd"/>
+      <w:r>
+        <w:rPr>
+          <w:rFonts w:cstheme="minorHAnsi"/>
+          <w:sz w:val="24"/>
+          <w:szCs w:val="24"/>
+        </w:rPr>
+        <w:t xml:space="preserve"> Controller is </w:t>
       </w:r>
       <w:r>
         <w:rPr>
@@ -507,23 +543,7 @@
           <w:sz w:val="24"/>
           <w:szCs w:val="24"/>
         </w:rPr>
-        <w:t xml:space="preserve">The device embeds TMC2160 high voltage stepper motor driver with a LAN9255 </w:t>
-      </w:r>
-      <w:r>
-        <w:rPr>
-          <w:rFonts w:cstheme="minorHAnsi"/>
-          <w:sz w:val="24"/>
-          <w:szCs w:val="24"/>
-        </w:rPr>
-        <w:t>EtherCAT Device with integrated Cortex M4F Microcontroller</w:t>
-      </w:r>
-      <w:r>
-        <w:rPr>
-          <w:rFonts w:cstheme="minorHAnsi"/>
-          <w:sz w:val="24"/>
-          <w:szCs w:val="24"/>
-        </w:rPr>
-        <w:t>. The device features a smaller form factor which can be mount</w:t>
+        <w:t>The device embeds TMC2160 high voltage stepper motor driver with a LAN9255 EtherCAT Device with integrated Cortex M4F Microcontroller. The device features a smaller form factor which can be mount</w:t>
       </w:r>
       <w:r>
         <w:rPr>
@@ -539,32 +559,8 @@
           <w:sz w:val="24"/>
           <w:szCs w:val="24"/>
         </w:rPr>
-        <w:t xml:space="preserve"> Despite a smaller form-factor the device </w:t>
-      </w:r>
-      <w:r>
-        <w:rPr>
-          <w:rFonts w:cstheme="minorHAnsi"/>
-          <w:sz w:val="24"/>
-          <w:szCs w:val="24"/>
-        </w:rPr>
-        <w:t>printed circuit board is designed to draw heat out of the IC</w:t>
-      </w:r>
-      <w:r>
-        <w:rPr>
-          <w:rFonts w:cstheme="minorHAnsi"/>
-          <w:sz w:val="24"/>
-          <w:szCs w:val="24"/>
-        </w:rPr>
-        <w:t xml:space="preserve"> and MOSFETs.</w:t>
-      </w:r>
-    </w:p>
-    <w:p>
-      <w:pPr>
-        <w:jc w:val="both"/>
-        <w:rPr>
-          <w:rFonts w:cstheme="minorHAnsi"/>
-        </w:rPr>
-      </w:pPr>
+        <w:t xml:space="preserve"> Despite a smaller form-factor the device printed circuit board is designed to draw heat out of the IC and MOSFETs.</w:t>
+      </w:r>
     </w:p>
     <w:p>
       <w:pPr>
@@ -735,11 +731,49 @@
     </w:p>
     <w:p>
       <w:pPr>
-        <w:jc w:val="both"/>
-        <w:rPr>
-          <w:rFonts w:cstheme="minorHAnsi"/>
-        </w:rPr>
-      </w:pPr>
+        <w:pStyle w:val="ListParagraph"/>
+        <w:numPr>
+          <w:ilvl w:val="0"/>
+          <w:numId w:val="1"/>
+        </w:numPr>
+        <w:jc w:val="both"/>
+        <w:rPr>
+          <w:rFonts w:cstheme="minorHAnsi"/>
+          <w:sz w:val="24"/>
+          <w:szCs w:val="24"/>
+        </w:rPr>
+      </w:pPr>
+      <w:r>
+        <w:rPr>
+          <w:rFonts w:cstheme="minorHAnsi"/>
+          <w:sz w:val="24"/>
+          <w:szCs w:val="24"/>
+        </w:rPr>
+        <w:t>Stall Error Detection</w:t>
+      </w:r>
+    </w:p>
+    <w:p>
+      <w:pPr>
+        <w:pStyle w:val="ListParagraph"/>
+        <w:numPr>
+          <w:ilvl w:val="0"/>
+          <w:numId w:val="1"/>
+        </w:numPr>
+        <w:jc w:val="both"/>
+        <w:rPr>
+          <w:rFonts w:cstheme="minorHAnsi"/>
+          <w:sz w:val="24"/>
+          <w:szCs w:val="24"/>
+        </w:rPr>
+      </w:pPr>
+      <w:r>
+        <w:rPr>
+          <w:rFonts w:cstheme="minorHAnsi"/>
+          <w:sz w:val="24"/>
+          <w:szCs w:val="24"/>
+        </w:rPr>
+        <w:t>Adjustment of torque values.</w:t>
+      </w:r>
     </w:p>
     <w:p>
       <w:pPr>
@@ -966,25 +1000,7 @@
               <w:rPr>
                 <w:rFonts w:cstheme="minorHAnsi"/>
               </w:rPr>
-              <w:t xml:space="preserve">Without Heatsink: 1.2A peak current - </w:t>
-            </w:r>
-            <w:r>
-              <w:rPr>
-                <w:rFonts w:cstheme="minorHAnsi"/>
-              </w:rPr>
-              <w:t xml:space="preserve">With Heatsink: </w:t>
-            </w:r>
-            <w:r>
-              <w:rPr>
-                <w:rFonts w:cstheme="minorHAnsi"/>
-              </w:rPr>
-              <w:t>2.5A</w:t>
-            </w:r>
-            <w:r>
-              <w:rPr>
-                <w:rFonts w:cstheme="minorHAnsi"/>
-              </w:rPr>
-              <w:t xml:space="preserve"> peak current</w:t>
+              <w:t>Without Heatsink: 1.2A peak current - With Heatsink: 2.5A peak current</w:t>
             </w:r>
           </w:p>
         </w:tc>
@@ -1287,6 +1303,14 @@
         </w:tc>
       </w:tr>
     </w:tbl>
+    <w:p>
+      <w:pPr>
+        <w:jc w:val="both"/>
+        <w:rPr>
+          <w:rFonts w:cstheme="minorHAnsi"/>
+        </w:rPr>
+      </w:pPr>
+    </w:p>
     <w:p>
       <w:pPr>
         <w:jc w:val="both"/>
@@ -1664,23 +1688,7 @@
           <w:sz w:val="24"/>
           <w:szCs w:val="24"/>
         </w:rPr>
-        <w:t xml:space="preserve">Pic: </w:t>
-      </w:r>
-      <w:r>
-        <w:rPr>
-          <w:rFonts w:cstheme="minorHAnsi"/>
-          <w:sz w:val="24"/>
-          <w:szCs w:val="24"/>
-        </w:rPr>
-        <w:t>Bottom</w:t>
-      </w:r>
-      <w:r>
-        <w:rPr>
-          <w:rFonts w:cstheme="minorHAnsi"/>
-          <w:sz w:val="24"/>
-          <w:szCs w:val="24"/>
-        </w:rPr>
-        <w:t xml:space="preserve"> Board - top side on the left and bottom side on the right</w:t>
+        <w:t>Pic: Bottom Board - top side on the left and bottom side on the right</w:t>
       </w:r>
     </w:p>
     <w:p>
@@ -1984,23 +1992,7 @@
           <w:sz w:val="24"/>
           <w:szCs w:val="24"/>
         </w:rPr>
-        <w:t xml:space="preserve">Pic: </w:t>
-      </w:r>
-      <w:r>
-        <w:rPr>
-          <w:rFonts w:cstheme="minorHAnsi"/>
-          <w:sz w:val="24"/>
-          <w:szCs w:val="24"/>
-        </w:rPr>
-        <w:t>Top</w:t>
-      </w:r>
-      <w:r>
-        <w:rPr>
-          <w:rFonts w:cstheme="minorHAnsi"/>
-          <w:sz w:val="24"/>
-          <w:szCs w:val="24"/>
-        </w:rPr>
-        <w:t xml:space="preserve"> Board</w:t>
+        <w:t>Pic: Top Board</w:t>
       </w:r>
     </w:p>
     <w:p>
@@ -2075,23 +2067,7 @@
           <w:sz w:val="24"/>
           <w:szCs w:val="24"/>
         </w:rPr>
-        <w:t xml:space="preserve">Pic: </w:t>
-      </w:r>
-      <w:r>
-        <w:rPr>
-          <w:rFonts w:cstheme="minorHAnsi"/>
-          <w:sz w:val="24"/>
-          <w:szCs w:val="24"/>
-        </w:rPr>
-        <w:t>Bottom</w:t>
-      </w:r>
-      <w:r>
-        <w:rPr>
-          <w:rFonts w:cstheme="minorHAnsi"/>
-          <w:sz w:val="24"/>
-          <w:szCs w:val="24"/>
-        </w:rPr>
-        <w:t xml:space="preserve"> Board</w:t>
+        <w:t>Pic: Bottom Board</w:t>
       </w:r>
     </w:p>
     <w:p>
@@ -2112,16 +2088,7 @@
           <w:szCs w:val="28"/>
         </w:rPr>
         <w:lastRenderedPageBreak/>
-        <w:t xml:space="preserve">Heat Sink </w:t>
-      </w:r>
-      <w:r>
-        <w:rPr>
-          <w:rFonts w:ascii="Arial" w:hAnsi="Arial" w:cs="Arial"/>
-          <w:color w:val="4472C4" w:themeColor="accent1"/>
-          <w:sz w:val="28"/>
-          <w:szCs w:val="28"/>
-        </w:rPr>
-        <w:t>Dimensions</w:t>
+        <w:t>Heat Sink Dimensions</w:t>
       </w:r>
     </w:p>
     <w:p>
@@ -2721,6 +2688,7 @@
   <w:style w:type="character" w:default="1" w:styleId="DefaultParagraphFont">
     <w:name w:val="Default Paragraph Font"/>
     <w:uiPriority w:val="1"/>
+    <w:semiHidden/>
     <w:unhideWhenUsed/>
   </w:style>
   <w:style w:type="table" w:default="1" w:styleId="TableNormal">

</xml_diff>